<commit_message>
Add logic tasks section to tasks.html with links for easy and medium levels. Update existing logic problems in the document with answers for clarity.
</commit_message>
<xml_diff>
--- a/Задачки (1).docx
+++ b/Задачки (1).docx
@@ -2346,79 +2346,379 @@
       </w:r>
     </w:p>
     <w:p>
-      <w:r>
-        <w:t>1. Стив построил 6 домов, а Алекс построила на 2 дома больше. Сколько домов построила Алекс?</w:t>
-      </w:r>
-    </w:p>
-    <w:p>
-      <w:r>
-        <w:t>2. У Стива есть 7 алмазов, а у Алекса на 3 алмаза меньше. Сколько алмазов у Алекса?</w:t>
-      </w:r>
-    </w:p>
-    <w:p>
-      <w:r>
-        <w:t>3. В сундуке лежит 8 яблок, 5 морковок и 7 картошек. Сколько всего овощей и фруктов в сундуке?</w:t>
-      </w:r>
-    </w:p>
-    <w:p>
-      <w:r>
-        <w:t>4. Стив посадил 10 деревьев. 4 дерева выросли, а остальные нет. Сколько деревьев не выросло?</w:t>
-      </w:r>
-    </w:p>
-    <w:p>
-      <w:r>
-        <w:t>5. У Стива 3 кирки, а у Алекса в 2 раза больше. Сколько кирок у Алекса?</w:t>
-      </w:r>
-    </w:p>
-    <w:p>
-      <w:r>
-        <w:t>6. В шахте Стив нашёл 5 железных руд и 4 золотых. Сколько всего руд он нашёл?</w:t>
-      </w:r>
-    </w:p>
-    <w:p>
-      <w:r>
-        <w:t>7. У Алекса 9 хлебов. Она дала Стиву 4 хлеба. Сколько хлебов осталось у Алекса?</w:t>
-      </w:r>
-    </w:p>
-    <w:p>
-      <w:r>
-        <w:t>8. Стив поймал 6 рыб, а Алекс – на 2 рыбы больше. Сколько рыб поймала Алекс?</w:t>
-      </w:r>
-    </w:p>
-    <w:p>
-      <w:r>
-        <w:t>9. В деревне живут 3 жителя, а в соседней деревне на 5 жителей больше. Сколько жителей в соседней деревне?</w:t>
-      </w:r>
-    </w:p>
-    <w:p>
-      <w:r>
-        <w:t>10. Стив построил башню из 12 блоков. 5 блоков он снял. Сколько блоков осталось в башне?</w:t>
-      </w:r>
-    </w:p>
-    <w:p>
-      <w:r>
-        <w:t>11. У Стива было 10 стрел. В бою он потратил 7 стрел. Сколько стрел осталось у Стива?</w:t>
-      </w:r>
-    </w:p>
-    <w:p>
-      <w:r>
-        <w:t>12. Алекс собрала 8 цветов, а Стив – 2 цветка. На сколько цветов больше собрала Алекс?</w:t>
-      </w:r>
-    </w:p>
-    <w:p>
-      <w:r>
-        <w:t>13. В сундуке 4 железных меча и 3 золотых. Сколько всего мечей в сундуке?</w:t>
-      </w:r>
-    </w:p>
-    <w:p>
-      <w:r>
-        <w:t>14. Стив взял 5 факелов, а Алекс – 5 факелов. Сколько всего факелов они взяли вместе?</w:t>
-      </w:r>
-    </w:p>
-    <w:p>
-      <w:r>
-        <w:t>15. Алекс построила 7 лестниц, а Стив построил на 3 лестницы меньше. Сколько лестниц построил Стив?</w:t>
-      </w:r>
+      <w:pPr>
+        <w:pStyle w:val="a7"/>
+        <w:numPr>
+          <w:ilvl w:val="0"/>
+          <w:numId w:val="11"/>
+        </w:numPr>
+      </w:pPr>
+      <w:r>
+        <w:t>Стив построил 6 домов, а Алекс построила на 2 дома больше. Сколько домов построила Алекс?</w:t>
+      </w:r>
+    </w:p>
+    <w:p>
+      <w:pPr>
+        <w:ind w:firstLine="708"/>
+      </w:pPr>
+      <w:r>
+        <w:t xml:space="preserve">Ответ: </w:t>
+      </w:r>
+      <w:r>
+        <w:t>8</w:t>
+      </w:r>
+    </w:p>
+    <w:p>
+      <w:pPr>
+        <w:pStyle w:val="a7"/>
+        <w:numPr>
+          <w:ilvl w:val="0"/>
+          <w:numId w:val="11"/>
+        </w:numPr>
+      </w:pPr>
+      <w:r>
+        <w:t>У Стива есть 7 алмазов, а у Алекса на 3 алмаза меньше. Сколько алмазов у Алекса?</w:t>
+      </w:r>
+    </w:p>
+    <w:p>
+      <w:pPr>
+        <w:pStyle w:val="a7"/>
+      </w:pPr>
+      <w:r>
+        <w:t xml:space="preserve">Ответ: </w:t>
+      </w:r>
+      <w:r>
+        <w:t>4</w:t>
+      </w:r>
+    </w:p>
+    <w:p>
+      <w:pPr>
+        <w:pStyle w:val="a7"/>
+        <w:numPr>
+          <w:ilvl w:val="0"/>
+          <w:numId w:val="11"/>
+        </w:numPr>
+      </w:pPr>
+      <w:r>
+        <w:t>В сундуке лежит 8 яблок, 5 морковок и 7 картошек. Сколько всего овощей в сундуке?</w:t>
+      </w:r>
+    </w:p>
+    <w:p>
+      <w:pPr>
+        <w:pStyle w:val="a7"/>
+      </w:pPr>
+      <w:r>
+        <w:t>Ответ: 12</w:t>
+      </w:r>
+    </w:p>
+    <w:p>
+      <w:pPr>
+        <w:pStyle w:val="a7"/>
+        <w:numPr>
+          <w:ilvl w:val="0"/>
+          <w:numId w:val="11"/>
+        </w:numPr>
+      </w:pPr>
+      <w:r>
+        <w:t>Стив посадил 10 деревьев. 4 дерева выросли, а остальные нет. Сколько деревьев не выросло?</w:t>
+      </w:r>
+    </w:p>
+    <w:p>
+      <w:pPr>
+        <w:pStyle w:val="a7"/>
+      </w:pPr>
+      <w:r>
+        <w:t>Ответ: 6</w:t>
+      </w:r>
+    </w:p>
+    <w:p>
+      <w:pPr>
+        <w:pStyle w:val="a7"/>
+        <w:numPr>
+          <w:ilvl w:val="0"/>
+          <w:numId w:val="11"/>
+        </w:numPr>
+      </w:pPr>
+      <w:r>
+        <w:t>У Стива 3 кирки, а у Алекса в 2 раза больше. Сколько кирок у Алекса?</w:t>
+      </w:r>
+    </w:p>
+    <w:p>
+      <w:pPr>
+        <w:pStyle w:val="a7"/>
+      </w:pPr>
+      <w:r>
+        <w:t>Ответ: 6</w:t>
+      </w:r>
+    </w:p>
+    <w:p>
+      <w:pPr>
+        <w:pStyle w:val="a7"/>
+        <w:numPr>
+          <w:ilvl w:val="0"/>
+          <w:numId w:val="11"/>
+        </w:numPr>
+      </w:pPr>
+      <w:r>
+        <w:t>В шахте Стив нашёл 5 железных руд и 4 золотых. Сколько всего руд он нашёл?</w:t>
+      </w:r>
+    </w:p>
+    <w:p>
+      <w:pPr>
+        <w:pStyle w:val="a7"/>
+      </w:pPr>
+      <w:r>
+        <w:t xml:space="preserve">Ответ: </w:t>
+      </w:r>
+      <w:r>
+        <w:t>9</w:t>
+      </w:r>
+    </w:p>
+    <w:p>
+      <w:pPr>
+        <w:pStyle w:val="a7"/>
+        <w:numPr>
+          <w:ilvl w:val="0"/>
+          <w:numId w:val="11"/>
+        </w:numPr>
+      </w:pPr>
+      <w:r>
+        <w:t xml:space="preserve">У Алекса 9 </w:t>
+      </w:r>
+      <w:r>
+        <w:t>буханок хлеба</w:t>
+      </w:r>
+      <w:r>
+        <w:t xml:space="preserve">. Она дала Стиву 4 </w:t>
+      </w:r>
+      <w:r>
+        <w:t xml:space="preserve">буханки </w:t>
+      </w:r>
+      <w:r>
+        <w:t xml:space="preserve">хлеба. Сколько </w:t>
+      </w:r>
+      <w:r>
+        <w:t>буханок</w:t>
+      </w:r>
+      <w:r>
+        <w:t xml:space="preserve"> осталось у Алекса?</w:t>
+      </w:r>
+    </w:p>
+    <w:p>
+      <w:pPr>
+        <w:pStyle w:val="a7"/>
+      </w:pPr>
+      <w:r>
+        <w:t xml:space="preserve">Ответ: </w:t>
+      </w:r>
+      <w:r>
+        <w:t>5</w:t>
+      </w:r>
+    </w:p>
+    <w:p>
+      <w:pPr>
+        <w:pStyle w:val="a7"/>
+        <w:numPr>
+          <w:ilvl w:val="0"/>
+          <w:numId w:val="11"/>
+        </w:numPr>
+      </w:pPr>
+      <w:r>
+        <w:t>Стив поймал 6 рыб, а Алекс – на 2 рыбы больше. Сколько рыб поймала Алекс?</w:t>
+      </w:r>
+    </w:p>
+    <w:p>
+      <w:pPr>
+        <w:pStyle w:val="a7"/>
+      </w:pPr>
+      <w:r>
+        <w:t xml:space="preserve">Ответ: </w:t>
+      </w:r>
+      <w:r>
+        <w:t>8</w:t>
+      </w:r>
+    </w:p>
+    <w:p>
+      <w:pPr>
+        <w:pStyle w:val="a7"/>
+        <w:numPr>
+          <w:ilvl w:val="0"/>
+          <w:numId w:val="11"/>
+        </w:numPr>
+      </w:pPr>
+      <w:r>
+        <w:t xml:space="preserve">В деревне живут 3 жителя, а в соседней деревне на 5 жителей больше. Сколько жителей </w:t>
+      </w:r>
+      <w:r>
+        <w:t>живёт в двух этих деревнях</w:t>
+      </w:r>
+      <w:r>
+        <w:t>?</w:t>
+      </w:r>
+    </w:p>
+    <w:p>
+      <w:pPr>
+        <w:pStyle w:val="a7"/>
+      </w:pPr>
+      <w:r>
+        <w:t xml:space="preserve">Ответ: </w:t>
+      </w:r>
+      <w:r>
+        <w:t>11</w:t>
+      </w:r>
+    </w:p>
+    <w:p>
+      <w:pPr>
+        <w:pStyle w:val="a7"/>
+        <w:numPr>
+          <w:ilvl w:val="0"/>
+          <w:numId w:val="11"/>
+        </w:numPr>
+      </w:pPr>
+      <w:r>
+        <w:t xml:space="preserve">Стив построил башню из 12 блоков. 5 блоков он </w:t>
+      </w:r>
+      <w:r>
+        <w:t>сломал</w:t>
+      </w:r>
+      <w:r>
+        <w:t>. Сколько блоков осталось в башне?</w:t>
+      </w:r>
+    </w:p>
+    <w:p>
+      <w:pPr>
+        <w:pStyle w:val="a7"/>
+      </w:pPr>
+      <w:r>
+        <w:t xml:space="preserve">Ответ: </w:t>
+      </w:r>
+      <w:r>
+        <w:t>7</w:t>
+      </w:r>
+    </w:p>
+    <w:p>
+      <w:pPr>
+        <w:pStyle w:val="a7"/>
+        <w:numPr>
+          <w:ilvl w:val="0"/>
+          <w:numId w:val="11"/>
+        </w:numPr>
+      </w:pPr>
+      <w:r>
+        <w:t>У Стива было 10 стрел. В бою он потратил 7 стрел. Сколько стрел осталось у Стива?</w:t>
+      </w:r>
+    </w:p>
+    <w:p>
+      <w:pPr>
+        <w:pStyle w:val="a7"/>
+      </w:pPr>
+      <w:r>
+        <w:t xml:space="preserve">Ответ: </w:t>
+      </w:r>
+      <w:r>
+        <w:t>3</w:t>
+      </w:r>
+    </w:p>
+    <w:p>
+      <w:pPr>
+        <w:pStyle w:val="a7"/>
+        <w:numPr>
+          <w:ilvl w:val="0"/>
+          <w:numId w:val="11"/>
+        </w:numPr>
+      </w:pPr>
+      <w:r>
+        <w:t>Алекс собрала 8 цветов, а Стив – 2 цветка. На сколько цветов больше собрала Алекс?</w:t>
+      </w:r>
+    </w:p>
+    <w:p>
+      <w:pPr>
+        <w:pStyle w:val="a7"/>
+      </w:pPr>
+      <w:r>
+        <w:t xml:space="preserve">Ответ: </w:t>
+      </w:r>
+      <w:r>
+        <w:t>6</w:t>
+      </w:r>
+    </w:p>
+    <w:p>
+      <w:pPr>
+        <w:pStyle w:val="a7"/>
+        <w:numPr>
+          <w:ilvl w:val="0"/>
+          <w:numId w:val="11"/>
+        </w:numPr>
+      </w:pPr>
+      <w:r>
+        <w:lastRenderedPageBreak/>
+        <w:t>В сундуке 4 железных меча и 3 золотых. Сколько всего мечей в сундуке?</w:t>
+      </w:r>
+    </w:p>
+    <w:p>
+      <w:pPr>
+        <w:pStyle w:val="a7"/>
+      </w:pPr>
+      <w:r>
+        <w:t xml:space="preserve">Ответ: </w:t>
+      </w:r>
+      <w:r>
+        <w:t>7</w:t>
+      </w:r>
+    </w:p>
+    <w:p>
+      <w:pPr>
+        <w:pStyle w:val="a7"/>
+        <w:numPr>
+          <w:ilvl w:val="0"/>
+          <w:numId w:val="11"/>
+        </w:numPr>
+      </w:pPr>
+      <w:r>
+        <w:t>Стив взял 5 факелов, Алекс</w:t>
+      </w:r>
+      <w:r>
+        <w:t xml:space="preserve"> взяла столько же</w:t>
+      </w:r>
+      <w:r>
+        <w:t>. Сколько всего факелов они взяли вместе?</w:t>
+      </w:r>
+    </w:p>
+    <w:p>
+      <w:pPr>
+        <w:pStyle w:val="a7"/>
+      </w:pPr>
+      <w:r>
+        <w:t xml:space="preserve">Ответ: </w:t>
+      </w:r>
+      <w:r>
+        <w:t>10</w:t>
+      </w:r>
+    </w:p>
+    <w:p>
+      <w:pPr>
+        <w:pStyle w:val="a7"/>
+        <w:numPr>
+          <w:ilvl w:val="0"/>
+          <w:numId w:val="11"/>
+        </w:numPr>
+      </w:pPr>
+      <w:r>
+        <w:t>Алекс построила 7 лестниц, а Стив построил на 3 лестницы меньше. Сколько лестниц построил Стив?</w:t>
+      </w:r>
+    </w:p>
+    <w:p>
+      <w:pPr>
+        <w:pStyle w:val="a7"/>
+      </w:pPr>
+      <w:r>
+        <w:t xml:space="preserve">Ответ: </w:t>
+      </w:r>
+      <w:r>
+        <w:t>4</w:t>
+      </w:r>
+      <w:bookmarkStart w:id="0" w:name="_GoBack"/>
+      <w:bookmarkEnd w:id="0"/>
     </w:p>
     <w:p/>
     <w:p>
@@ -2451,7 +2751,6 @@
           <w:rStyle w:val="ae"/>
           <w:rFonts w:eastAsiaTheme="majorEastAsia"/>
         </w:rPr>
-        <w:lastRenderedPageBreak/>
         <w:t>1.</w:t>
       </w:r>
       <w:r>
@@ -2510,8 +2809,6 @@
         </w:rPr>
         <w:t>2</w:t>
       </w:r>
-      <w:bookmarkStart w:id="0" w:name="_GoBack"/>
-      <w:bookmarkEnd w:id="0"/>
       <w:r>
         <w:t xml:space="preserve"> алмазных.</w:t>
       </w:r>
@@ -2795,6 +3092,7 @@
           <w:rStyle w:val="ae"/>
           <w:rFonts w:eastAsiaTheme="majorEastAsia"/>
         </w:rPr>
+        <w:lastRenderedPageBreak/>
         <w:t>12.</w:t>
       </w:r>
       <w:r>
@@ -3019,9 +3317,9 @@
     </w:lvl>
   </w:abstractNum>
   <w:abstractNum w:abstractNumId="1" w15:restartNumberingAfterBreak="0">
-    <w:nsid w:val="3E1E3B8C"/>
+    <w:nsid w:val="3B1E3992"/>
     <w:multiLevelType w:val="hybridMultilevel"/>
-    <w:tmpl w:val="42F4D76C"/>
+    <w:tmpl w:val="C77A4FCE"/>
     <w:lvl w:ilvl="0" w:tplc="0419000F">
       <w:start w:val="1"/>
       <w:numFmt w:val="decimal"/>
@@ -3030,8 +3328,11 @@
       <w:pPr>
         <w:ind w:left="720" w:hanging="360"/>
       </w:pPr>
-    </w:lvl>
-    <w:lvl w:ilvl="1" w:tplc="04190019">
+      <w:rPr>
+        <w:rFonts w:hint="default"/>
+      </w:rPr>
+    </w:lvl>
+    <w:lvl w:ilvl="1" w:tplc="04190019" w:tentative="1">
       <w:start w:val="1"/>
       <w:numFmt w:val="lowerLetter"/>
       <w:lvlText w:val="%2."/>
@@ -3105,6 +3406,92 @@
     </w:lvl>
   </w:abstractNum>
   <w:abstractNum w:abstractNumId="2" w15:restartNumberingAfterBreak="0">
+    <w:nsid w:val="3E1E3B8C"/>
+    <w:multiLevelType w:val="hybridMultilevel"/>
+    <w:tmpl w:val="4EEC3A80"/>
+    <w:lvl w:ilvl="0" w:tplc="0419000F">
+      <w:start w:val="1"/>
+      <w:numFmt w:val="decimal"/>
+      <w:lvlText w:val="%1."/>
+      <w:lvlJc w:val="left"/>
+      <w:pPr>
+        <w:ind w:left="720" w:hanging="360"/>
+      </w:pPr>
+    </w:lvl>
+    <w:lvl w:ilvl="1" w:tplc="04190019">
+      <w:start w:val="1"/>
+      <w:numFmt w:val="lowerLetter"/>
+      <w:lvlText w:val="%2."/>
+      <w:lvlJc w:val="left"/>
+      <w:pPr>
+        <w:ind w:left="1440" w:hanging="360"/>
+      </w:pPr>
+    </w:lvl>
+    <w:lvl w:ilvl="2" w:tplc="0419001B" w:tentative="1">
+      <w:start w:val="1"/>
+      <w:numFmt w:val="lowerRoman"/>
+      <w:lvlText w:val="%3."/>
+      <w:lvlJc w:val="right"/>
+      <w:pPr>
+        <w:ind w:left="2160" w:hanging="180"/>
+      </w:pPr>
+    </w:lvl>
+    <w:lvl w:ilvl="3" w:tplc="0419000F" w:tentative="1">
+      <w:start w:val="1"/>
+      <w:numFmt w:val="decimal"/>
+      <w:lvlText w:val="%4."/>
+      <w:lvlJc w:val="left"/>
+      <w:pPr>
+        <w:ind w:left="2880" w:hanging="360"/>
+      </w:pPr>
+    </w:lvl>
+    <w:lvl w:ilvl="4" w:tplc="04190019" w:tentative="1">
+      <w:start w:val="1"/>
+      <w:numFmt w:val="lowerLetter"/>
+      <w:lvlText w:val="%5."/>
+      <w:lvlJc w:val="left"/>
+      <w:pPr>
+        <w:ind w:left="3600" w:hanging="360"/>
+      </w:pPr>
+    </w:lvl>
+    <w:lvl w:ilvl="5" w:tplc="0419001B" w:tentative="1">
+      <w:start w:val="1"/>
+      <w:numFmt w:val="lowerRoman"/>
+      <w:lvlText w:val="%6."/>
+      <w:lvlJc w:val="right"/>
+      <w:pPr>
+        <w:ind w:left="4320" w:hanging="180"/>
+      </w:pPr>
+    </w:lvl>
+    <w:lvl w:ilvl="6" w:tplc="0419000F" w:tentative="1">
+      <w:start w:val="1"/>
+      <w:numFmt w:val="decimal"/>
+      <w:lvlText w:val="%7."/>
+      <w:lvlJc w:val="left"/>
+      <w:pPr>
+        <w:ind w:left="5040" w:hanging="360"/>
+      </w:pPr>
+    </w:lvl>
+    <w:lvl w:ilvl="7" w:tplc="04190019" w:tentative="1">
+      <w:start w:val="1"/>
+      <w:numFmt w:val="lowerLetter"/>
+      <w:lvlText w:val="%8."/>
+      <w:lvlJc w:val="left"/>
+      <w:pPr>
+        <w:ind w:left="5760" w:hanging="360"/>
+      </w:pPr>
+    </w:lvl>
+    <w:lvl w:ilvl="8" w:tplc="0419001B" w:tentative="1">
+      <w:start w:val="1"/>
+      <w:numFmt w:val="lowerRoman"/>
+      <w:lvlText w:val="%9."/>
+      <w:lvlJc w:val="right"/>
+      <w:pPr>
+        <w:ind w:left="6480" w:hanging="180"/>
+      </w:pPr>
+    </w:lvl>
+  </w:abstractNum>
+  <w:abstractNum w:abstractNumId="3" w15:restartNumberingAfterBreak="0">
     <w:nsid w:val="3EB85F33"/>
     <w:multiLevelType w:val="hybridMultilevel"/>
     <w:tmpl w:val="DE60985E"/>
@@ -3193,7 +3580,7 @@
       </w:pPr>
     </w:lvl>
   </w:abstractNum>
-  <w:abstractNum w:abstractNumId="3" w15:restartNumberingAfterBreak="0">
+  <w:abstractNum w:abstractNumId="4" w15:restartNumberingAfterBreak="0">
     <w:nsid w:val="46B37E30"/>
     <w:multiLevelType w:val="hybridMultilevel"/>
     <w:tmpl w:val="96DAC04A"/>
@@ -3282,7 +3669,7 @@
       </w:pPr>
     </w:lvl>
   </w:abstractNum>
-  <w:abstractNum w:abstractNumId="4" w15:restartNumberingAfterBreak="0">
+  <w:abstractNum w:abstractNumId="5" w15:restartNumberingAfterBreak="0">
     <w:nsid w:val="4C9238B0"/>
     <w:multiLevelType w:val="multilevel"/>
     <w:tmpl w:val="FA38D8C0"/>
@@ -3395,7 +3782,7 @@
       </w:pPr>
     </w:lvl>
   </w:abstractNum>
-  <w:abstractNum w:abstractNumId="5" w15:restartNumberingAfterBreak="0">
+  <w:abstractNum w:abstractNumId="6" w15:restartNumberingAfterBreak="0">
     <w:nsid w:val="5F755DFB"/>
     <w:multiLevelType w:val="hybridMultilevel"/>
     <w:tmpl w:val="69CC14CA"/>
@@ -3481,7 +3868,7 @@
       </w:pPr>
     </w:lvl>
   </w:abstractNum>
-  <w:abstractNum w:abstractNumId="6" w15:restartNumberingAfterBreak="0">
+  <w:abstractNum w:abstractNumId="7" w15:restartNumberingAfterBreak="0">
     <w:nsid w:val="60DC2ED2"/>
     <w:multiLevelType w:val="hybridMultilevel"/>
     <w:tmpl w:val="05AE5F9C"/>
@@ -3570,7 +3957,7 @@
       </w:pPr>
     </w:lvl>
   </w:abstractNum>
-  <w:abstractNum w:abstractNumId="7" w15:restartNumberingAfterBreak="0">
+  <w:abstractNum w:abstractNumId="8" w15:restartNumberingAfterBreak="0">
     <w:nsid w:val="67BC6B58"/>
     <w:multiLevelType w:val="hybridMultilevel"/>
     <w:tmpl w:val="9A02BB1C"/>
@@ -3656,7 +4043,7 @@
       </w:pPr>
     </w:lvl>
   </w:abstractNum>
-  <w:abstractNum w:abstractNumId="8" w15:restartNumberingAfterBreak="0">
+  <w:abstractNum w:abstractNumId="9" w15:restartNumberingAfterBreak="0">
     <w:nsid w:val="685544D7"/>
     <w:multiLevelType w:val="hybridMultilevel"/>
     <w:tmpl w:val="331C2788"/>
@@ -3745,7 +4132,7 @@
       </w:pPr>
     </w:lvl>
   </w:abstractNum>
-  <w:abstractNum w:abstractNumId="9" w15:restartNumberingAfterBreak="0">
+  <w:abstractNum w:abstractNumId="10" w15:restartNumberingAfterBreak="0">
     <w:nsid w:val="6E8A6FC2"/>
     <w:multiLevelType w:val="hybridMultilevel"/>
     <w:tmpl w:val="8C308644"/>
@@ -3835,34 +4222,37 @@
     </w:lvl>
   </w:abstractNum>
   <w:num w:numId="1">
+    <w:abstractNumId w:val="10"/>
+  </w:num>
+  <w:num w:numId="2">
+    <w:abstractNumId w:val="4"/>
+  </w:num>
+  <w:num w:numId="3">
     <w:abstractNumId w:val="9"/>
   </w:num>
-  <w:num w:numId="2">
-    <w:abstractNumId w:val="3"/>
+  <w:num w:numId="4">
+    <w:abstractNumId w:val="7"/>
   </w:num>
-  <w:num w:numId="3">
-    <w:abstractNumId w:val="8"/>
-  </w:num>
-  <w:num w:numId="4">
+  <w:num w:numId="5">
     <w:abstractNumId w:val="6"/>
   </w:num>
-  <w:num w:numId="5">
-    <w:abstractNumId w:val="5"/>
-  </w:num>
   <w:num w:numId="6">
-    <w:abstractNumId w:val="7"/>
+    <w:abstractNumId w:val="8"/>
   </w:num>
   <w:num w:numId="7">
     <w:abstractNumId w:val="0"/>
   </w:num>
   <w:num w:numId="8">
-    <w:abstractNumId w:val="1"/>
+    <w:abstractNumId w:val="2"/>
   </w:num>
   <w:num w:numId="9">
-    <w:abstractNumId w:val="2"/>
+    <w:abstractNumId w:val="3"/>
   </w:num>
   <w:num w:numId="10">
-    <w:abstractNumId w:val="4"/>
+    <w:abstractNumId w:val="5"/>
+  </w:num>
+  <w:num w:numId="11">
+    <w:abstractNumId w:val="1"/>
   </w:num>
 </w:numbering>
 </file>
@@ -5169,7 +5559,7 @@
 </file>
 
 <file path=customXml/itemProps1.xml><?xml version="1.0" encoding="utf-8"?>
-<ds:datastoreItem xmlns:ds="http://schemas.openxmlformats.org/officeDocument/2006/customXml" ds:itemID="{ACD16DC0-084A-4842-B49B-00207808A5EA}">
+<ds:datastoreItem xmlns:ds="http://schemas.openxmlformats.org/officeDocument/2006/customXml" ds:itemID="{EAFEDD6D-ED46-4B59-B57E-15469C0FF53E}">
   <ds:schemaRefs>
     <ds:schemaRef ds:uri="http://schemas.openxmlformats.org/officeDocument/2006/bibliography"/>
   </ds:schemaRefs>

</xml_diff>